<commit_message>
Add SubjectController and Subject model; implement CRUD operations for subjects
- Created SubjectController with endpoints for GET, POST, PUT, and DELETE operations.
- Added Subject model with properties Id and Subject_Name.
- Updated DocumentLayout and ApiEndpoints to include new Subject API.
- Removed unnecessary files and updated project references.
</commit_message>
<xml_diff>
--- a/Lab 7 Concepts.docx
+++ b/Lab 7 Concepts.docx
@@ -83,6 +83,13 @@
         </w:rPr>
         <w:t>Why?</w:t>
       </w:r>
+      <w:r>
+        <w:rPr>
+          <w:b/>
+          <w:bCs/>
+        </w:rPr>
+        <w:t xml:space="preserve">     </w:t>
+      </w:r>
     </w:p>
     <w:p>
       <w:r>
@@ -180,41 +187,23 @@
     </w:p>
     <w:p>
       <w:r>
-        <w:t>Because it provides API features like HTTP response methods (</w:t>
-      </w:r>
-      <w:proofErr w:type="gramStart"/>
-      <w:r>
-        <w:t>Ok(</w:t>
-      </w:r>
-      <w:proofErr w:type="gramEnd"/>
-      <w:r>
-        <w:t xml:space="preserve">), </w:t>
+        <w:t xml:space="preserve">Because it provides API features like HTTP response methods (Ok(), </w:t>
       </w:r>
       <w:proofErr w:type="spellStart"/>
-      <w:proofErr w:type="gramStart"/>
       <w:r>
         <w:t>BadRequest</w:t>
       </w:r>
       <w:proofErr w:type="spellEnd"/>
       <w:r>
-        <w:t>(</w:t>
-      </w:r>
-      <w:proofErr w:type="gramEnd"/>
-      <w:r>
-        <w:t xml:space="preserve">), </w:t>
+        <w:t xml:space="preserve">(), </w:t>
       </w:r>
       <w:proofErr w:type="spellStart"/>
-      <w:proofErr w:type="gramStart"/>
       <w:r>
         <w:t>NotFound</w:t>
       </w:r>
       <w:proofErr w:type="spellEnd"/>
       <w:r>
-        <w:t>(</w:t>
-      </w:r>
-      <w:proofErr w:type="gramEnd"/>
-      <w:r>
-        <w:t>)) while remaining lightweight and focused on APIs.</w:t>
+        <w:t>()) while remaining lightweight and focused on APIs.</w:t>
       </w:r>
     </w:p>
     <w:p/>
@@ -230,23 +219,7 @@
           <w:b/>
           <w:bCs/>
         </w:rPr>
-        <w:t xml:space="preserve">Diff Between Controller </w:t>
-      </w:r>
-      <w:proofErr w:type="gramStart"/>
-      <w:r>
-        <w:rPr>
-          <w:b/>
-          <w:bCs/>
-        </w:rPr>
-        <w:t>And</w:t>
-      </w:r>
-      <w:proofErr w:type="gramEnd"/>
-      <w:r>
-        <w:rPr>
-          <w:b/>
-          <w:bCs/>
-        </w:rPr>
-        <w:t xml:space="preserve"> </w:t>
+        <w:t xml:space="preserve">Diff Between Controller And </w:t>
       </w:r>
       <w:proofErr w:type="spellStart"/>
       <w:r>
@@ -472,15 +445,7 @@
               <w:spacing w:after="160" w:line="278" w:lineRule="auto"/>
             </w:pPr>
             <w:r>
-              <w:t>Returns Views (</w:t>
-            </w:r>
-            <w:proofErr w:type="gramStart"/>
-            <w:r>
-              <w:t>View(</w:t>
-            </w:r>
-            <w:proofErr w:type="gramEnd"/>
-            <w:r>
-              <w:t>))</w:t>
+              <w:t>Returns Views (View())</w:t>
             </w:r>
           </w:p>
         </w:tc>
@@ -685,15 +650,7 @@
           <w:b/>
           <w:bCs/>
         </w:rPr>
-        <w:t xml:space="preserve">HTML page with embedded C# code </w:t>
-      </w:r>
-      <w:proofErr w:type="gramStart"/>
-      <w:r>
-        <w:rPr>
-          <w:b/>
-          <w:bCs/>
-        </w:rPr>
-        <w:t>(.</w:t>
+        <w:t>HTML page with embedded C# code (.</w:t>
       </w:r>
       <w:proofErr w:type="spellStart"/>
       <w:r>
@@ -704,7 +661,6 @@
         <w:t>cshtml</w:t>
       </w:r>
       <w:proofErr w:type="spellEnd"/>
-      <w:proofErr w:type="gramEnd"/>
       <w:r>
         <w:rPr>
           <w:b/>
@@ -814,49 +770,23 @@
     </w:p>
     <w:p>
       <w:r>
-        <w:t xml:space="preserve">Because it lets you return appropriate status codes and response types like </w:t>
-      </w:r>
-      <w:proofErr w:type="gramStart"/>
-      <w:r>
-        <w:t>Ok(</w:t>
-      </w:r>
-      <w:proofErr w:type="gramEnd"/>
-      <w:r>
-        <w:t xml:space="preserve">), </w:t>
+        <w:t xml:space="preserve">Because it lets you return appropriate status codes and response types like Ok(), </w:t>
       </w:r>
       <w:proofErr w:type="spellStart"/>
-      <w:proofErr w:type="gramStart"/>
       <w:r>
         <w:t>BadRequest</w:t>
       </w:r>
       <w:proofErr w:type="spellEnd"/>
       <w:r>
-        <w:t>(</w:t>
-      </w:r>
-      <w:proofErr w:type="gramEnd"/>
-      <w:r>
-        <w:t xml:space="preserve">), </w:t>
+        <w:t xml:space="preserve">(), </w:t>
       </w:r>
       <w:proofErr w:type="spellStart"/>
-      <w:proofErr w:type="gramStart"/>
       <w:r>
         <w:t>NotFound</w:t>
       </w:r>
       <w:proofErr w:type="spellEnd"/>
       <w:r>
-        <w:t>(</w:t>
-      </w:r>
-      <w:proofErr w:type="gramEnd"/>
-      <w:r>
-        <w:t xml:space="preserve">), and </w:t>
-      </w:r>
-      <w:proofErr w:type="gramStart"/>
-      <w:r>
-        <w:t>Created(</w:t>
-      </w:r>
-      <w:proofErr w:type="gramEnd"/>
-      <w:r>
-        <w:t>) from the same method.</w:t>
+        <w:t>(), and Created() from the same method.</w:t>
       </w:r>
     </w:p>
     <w:p/>
@@ -885,11 +815,9 @@
             <w:pPr>
               <w:spacing w:after="160" w:line="278" w:lineRule="auto"/>
             </w:pPr>
-            <w:proofErr w:type="spellStart"/>
             <w:r>
               <w:t>IActionResult</w:t>
             </w:r>
-            <w:proofErr w:type="spellEnd"/>
           </w:p>
         </w:tc>
         <w:tc>
@@ -902,13 +830,8 @@
               <w:spacing w:after="160" w:line="278" w:lineRule="auto"/>
               <w:cnfStyle w:val="100000000000" w:firstRow="1" w:lastRow="0" w:firstColumn="0" w:lastColumn="0" w:oddVBand="0" w:evenVBand="0" w:oddHBand="0" w:evenHBand="0" w:firstRowFirstColumn="0" w:firstRowLastColumn="0" w:lastRowFirstColumn="0" w:lastRowLastColumn="0"/>
             </w:pPr>
-            <w:proofErr w:type="spellStart"/>
-            <w:r>
-              <w:t>ActionResult</w:t>
-            </w:r>
-            <w:proofErr w:type="spellEnd"/>
-            <w:r>
-              <w:t>&lt;T&gt;</w:t>
+            <w:r>
+              <w:t>ActionResult&lt;T&gt;</w:t>
             </w:r>
           </w:p>
         </w:tc>
@@ -937,28 +860,9 @@
                 <w:bCs w:val="0"/>
                 <w:caps w:val="0"/>
               </w:rPr>
-              <w:t xml:space="preserve">returns an http response (such as </w:t>
-            </w:r>
-            <w:proofErr w:type="gramStart"/>
-            <w:r>
-              <w:rPr>
-                <w:b w:val="0"/>
-                <w:bCs w:val="0"/>
-                <w:caps w:val="0"/>
-              </w:rPr>
-              <w:t>ok(</w:t>
-            </w:r>
-            <w:proofErr w:type="gramEnd"/>
-            <w:r>
-              <w:rPr>
-                <w:b w:val="0"/>
-                <w:bCs w:val="0"/>
-                <w:caps w:val="0"/>
-              </w:rPr>
-              <w:t xml:space="preserve">), </w:t>
+              <w:t xml:space="preserve">returns an http response (such as ok(), </w:t>
             </w:r>
             <w:proofErr w:type="spellStart"/>
-            <w:proofErr w:type="gramStart"/>
             <w:r>
               <w:rPr>
                 <w:b w:val="0"/>
@@ -974,19 +878,9 @@
                 <w:bCs w:val="0"/>
                 <w:caps w:val="0"/>
               </w:rPr>
-              <w:t>(</w:t>
-            </w:r>
-            <w:proofErr w:type="gramEnd"/>
-            <w:r>
-              <w:rPr>
-                <w:b w:val="0"/>
-                <w:bCs w:val="0"/>
-                <w:caps w:val="0"/>
-              </w:rPr>
-              <w:t xml:space="preserve">), </w:t>
+              <w:t xml:space="preserve">(), </w:t>
             </w:r>
             <w:proofErr w:type="spellStart"/>
-            <w:proofErr w:type="gramStart"/>
             <w:r>
               <w:rPr>
                 <w:b w:val="0"/>
@@ -1002,16 +896,7 @@
                 <w:bCs w:val="0"/>
                 <w:caps w:val="0"/>
               </w:rPr>
-              <w:t>(</w:t>
-            </w:r>
-            <w:proofErr w:type="gramEnd"/>
-            <w:r>
-              <w:rPr>
-                <w:b w:val="0"/>
-                <w:bCs w:val="0"/>
-                <w:caps w:val="0"/>
-              </w:rPr>
-              <w:t>))</w:t>
+              <w:t>())</w:t>
             </w:r>
           </w:p>
         </w:tc>
@@ -1182,15 +1067,7 @@
           <w:b/>
           <w:bCs/>
         </w:rPr>
-        <w:t xml:space="preserve">  </w:t>
-      </w:r>
-      <w:proofErr w:type="gramStart"/>
-      <w:r>
-        <w:rPr>
-          <w:b/>
-          <w:bCs/>
-        </w:rPr>
-        <w:t xml:space="preserve">When </w:t>
+        <w:t xml:space="preserve">  When </w:t>
       </w:r>
       <w:r>
         <w:rPr>
@@ -1199,7 +1076,6 @@
         </w:rPr>
         <w:t>?</w:t>
       </w:r>
-      <w:proofErr w:type="gramEnd"/>
     </w:p>
     <w:p>
       <w:r>
@@ -1236,6 +1112,48 @@
         <w:t>To improve code quality, catch bugs early, and follow best practices.</w:t>
       </w:r>
     </w:p>
+    <w:p/>
+    <w:p/>
+    <w:p>
+      <w:r>
+        <w:t xml:space="preserve">What is </w:t>
+      </w:r>
+      <w:proofErr w:type="spellStart"/>
+      <w:r>
+        <w:t>RestAPI</w:t>
+      </w:r>
+      <w:proofErr w:type="spellEnd"/>
+      <w:r>
+        <w:t xml:space="preserve"> and </w:t>
+      </w:r>
+      <w:proofErr w:type="spellStart"/>
+      <w:r>
+        <w:t>RestFullAPI</w:t>
+      </w:r>
+      <w:proofErr w:type="spellEnd"/>
+      <w:r>
+        <w:t>?</w:t>
+      </w:r>
+    </w:p>
+    <w:p>
+      <w:r>
+        <w:t xml:space="preserve">Diff between </w:t>
+      </w:r>
+      <w:proofErr w:type="spellStart"/>
+      <w:r>
+        <w:t>FirstOrDefault</w:t>
+      </w:r>
+      <w:proofErr w:type="spellEnd"/>
+      <w:r>
+        <w:t xml:space="preserve"> and Find Method?</w:t>
+      </w:r>
+    </w:p>
+    <w:p>
+      <w:r>
+        <w:t>Diff between PUT() and PATCH()</w:t>
+      </w:r>
+    </w:p>
+    <w:p/>
     <w:sectPr>
       <w:pgSz w:w="11906" w:h="16838"/>
       <w:pgMar w:top="1440" w:right="1440" w:bottom="1440" w:left="1440" w:header="708" w:footer="708" w:gutter="0"/>
@@ -1849,6 +1767,7 @@
   <w:style w:type="character" w:default="1" w:styleId="DefaultParagraphFont">
     <w:name w:val="Default Paragraph Font"/>
     <w:uiPriority w:val="1"/>
+    <w:semiHidden/>
     <w:unhideWhenUsed/>
   </w:style>
   <w:style w:type="table" w:default="1" w:styleId="TableNormal">

</xml_diff>